<commit_message>
changed modules and nex fyp meeting
</commit_message>
<xml_diff>
--- a/modules/EEEE4077_mechatronics_proj/chapters/meeting_record_2.docx
+++ b/modules/EEEE4077_mechatronics_proj/chapters/meeting_record_2.docx
@@ -32,7 +32,7 @@
                     <pic:cNvPicPr/>
                   </pic:nvPicPr>
                   <pic:blipFill>
-                    <a:blip r:embed="rId17"/>
+                    <a:blip r:embed="rId18"/>
                     <a:stretch>
                       <a:fillRect/>
                     </a:stretch>
@@ -211,7 +211,7 @@
           <w:sz w:val="24"/>
           <w:szCs w:val="24"/>
         </w:rPr>
-        <w:t>: null</w:t>
+        <w:t>: path planning, robot navigation, localisation, obstacle avoidance</w:t>
       </w:r>
     </w:p>
     <w:p>
@@ -288,7 +288,7 @@
           <w:sz w:val="24"/>
           <w:szCs w:val="24"/>
         </w:rPr>
-        <w:t>: 2/10/2026</w:t>
+        <w:t>: 8/10/2026</w:t>
       </w:r>
       <w:r>
         <w:tab/>
@@ -435,23 +435,15 @@
                 <w:bCs/>
               </w:rPr>
             </w:pPr>
-          </w:p>
-          <w:p>
-            <w:pPr>
-              <w:rPr>
-                <w:b/>
-                <w:bCs/>
-              </w:rPr>
-            </w:pPr>
             <w:r>
               <w:rPr>
-                <w:rFonts w:ascii="Times New Roman" w:hAnsi="Times New Roman" w:eastAsia="等线" w:cs="Times New Roman" w:eastAsiaTheme="minorEastAsia"/>
+                <w:rFonts w:ascii="Times New Roman" w:hAnsi="Times New Roman" w:cs="Times New Roman"/>
                 <w:b/>
                 <w:bCs/>
                 <w:sz w:val="24"/>
                 <w:szCs w:val="24"/>
               </w:rPr>
-              <w:t>first meeting</w:t>
+              <w:t>Prepared a general idea of the FYP project proposal. Into 2 modes:</w:t>
             </w:r>
           </w:p>
           <w:p>
@@ -469,22 +461,70 @@
                 <w:bCs/>
               </w:rPr>
             </w:pPr>
-          </w:p>
-          <w:p>
-            <w:pPr>
-              <w:rPr>
-                <w:b/>
-                <w:bCs/>
-              </w:rPr>
-            </w:pPr>
-          </w:p>
-          <w:p>
-            <w:pPr>
-              <w:rPr>
-                <w:b/>
-                <w:bCs/>
-              </w:rPr>
-            </w:pPr>
+            <w:r>
+              <w:rPr>
+                <w:rFonts w:ascii="Times New Roman" w:hAnsi="Times New Roman" w:cs="Times New Roman"/>
+                <w:b/>
+                <w:bCs/>
+                <w:sz w:val="24"/>
+                <w:szCs w:val="24"/>
+              </w:rPr>
+              <w:t>1. 2D lidar + rgb detection sensor fusion</w:t>
+            </w:r>
+          </w:p>
+          <w:p>
+            <w:pPr>
+              <w:rPr>
+                <w:b/>
+                <w:bCs/>
+              </w:rPr>
+            </w:pPr>
+            <w:r>
+              <w:rPr>
+                <w:rFonts w:ascii="Times New Roman" w:hAnsi="Times New Roman" w:cs="Times New Roman"/>
+                <w:b/>
+                <w:bCs/>
+                <w:sz w:val="24"/>
+                <w:szCs w:val="24"/>
+              </w:rPr>
+              <w:t>2. Uses rgb detection to resolve navigation cost map ambiguity (such as puddle or grass etc), targeting brownfield factories</w:t>
+            </w:r>
+          </w:p>
+          <w:p>
+            <w:pPr>
+              <w:rPr>
+                <w:b/>
+                <w:bCs/>
+              </w:rPr>
+            </w:pPr>
+            <w:r>
+              <w:rPr>
+                <w:rFonts w:ascii="Times New Roman" w:hAnsi="Times New Roman" w:cs="Times New Roman"/>
+                <w:b/>
+                <w:bCs/>
+                <w:sz w:val="24"/>
+                <w:szCs w:val="24"/>
+              </w:rPr>
+              <w:t>3. Dynamic fine tuning for detetcion (the main bottleneck for implementation, that warants an expensive 3D full lidar equipment, which may not guarentee superior performance as well)</w:t>
+            </w:r>
+          </w:p>
+          <w:p>
+            <w:pPr>
+              <w:rPr>
+                <w:b/>
+                <w:bCs/>
+              </w:rPr>
+            </w:pPr>
+            <w:r>
+              <w:rPr>
+                <w:rFonts w:ascii="Times New Roman" w:hAnsi="Times New Roman" w:cs="Times New Roman"/>
+                <w:b/>
+                <w:bCs/>
+                <w:sz w:val="24"/>
+                <w:szCs w:val="24"/>
+              </w:rPr>
+              <w:t>4. kinematic trajectry prediction can be explored, allowing for more efficient navigation and obstacle avoidance rather than the [see obstacle -&gt; stop until safe]. since rgb detections allow instance identification thus kinematics of it</w:t>
+            </w:r>
           </w:p>
           <w:p>
             <w:pPr>
@@ -636,21 +676,7 @@
                 <w:sz w:val="24"/>
                 <w:szCs w:val="24"/>
               </w:rPr>
-              <w:t>prepare p</w:t>
-            </w:r>
-          </w:p>
-          <w:p>
-            <w:pPr>
-              <w:rPr>
-                <w:b/>
-                <w:bCs/>
-              </w:rPr>
-            </w:pPr>
-            <w:r>
-              <w:rPr>
-                <w:b/>
-                <w:bCs/>
-              </w:rPr>
+              <w:t>prepare a simple layman project proposal and research objectives for supervisor, to allow initial understanding and approval</w:t>
             </w:r>
           </w:p>
           <w:p>
@@ -842,7 +868,7 @@
                 <w:sz w:val="24"/>
                 <w:szCs w:val="24"/>
               </w:rPr>
-              <w:t>industry and academia has conflict of interest, and projects are generally capped due to lack of rot' parts</w:t>
+              <w:t>baseline is important, meaning matured and SOTA methods/results **must** be taken into account even before defining the scope (as well as implementation)</w:t>
             </w:r>
           </w:p>
           <w:p>

</xml_diff>